<commit_message>
Se completa la version preeliminar del GameMaster.cs; se inicia la redaccion del Reporte final de actividades del Servicio Social
</commit_message>
<xml_diff>
--- a/ReporteActividades.docx
+++ b/ReporteActividades.docx
@@ -21,7 +21,19 @@
         <w:jc w:val="both"/>
       </w:pPr>
       <w:r>
-        <w:t>El primer día se inició con el desarrollo de un Roll A Ball, principalmente para familiarizarse con el entorno de Unity. El mismo día se terminó el tutorial, pero al día siguiente se volvió a iniciar, ya que la versión utilizada</w:t>
+        <w:t xml:space="preserve">El primer día se inició con el desarrollo de un Roll A Ball, principalmente para familiarizarse con el entorno de Unity. El mismo día se terminó el tutorial, pero </w:t>
+      </w:r>
+      <w:r>
+        <w:t>el 10 de Febrero</w:t>
+      </w:r>
+      <w:r>
+        <w:t xml:space="preserve"> se volvió a iniciar</w:t>
+      </w:r>
+      <w:r>
+        <w:t xml:space="preserve"> el desarrollo</w:t>
+      </w:r>
+      <w:r>
+        <w:t>, ya que la versión utilizada</w:t>
       </w:r>
       <w:r>
         <w:t xml:space="preserve"> de Unity no era la solicitada por Yoá</w:t>
@@ -1010,6 +1022,28 @@
       </w:r>
       <w:r>
         <w:t>. El 11 de Septiembre se implementaron las fechas y horas de inicio de cada sesión.</w:t>
+      </w:r>
+    </w:p>
+    <w:p>
+      <w:pPr>
+        <w:jc w:val="both"/>
+        <w:rPr>
+          <w:b/>
+        </w:rPr>
+      </w:pPr>
+      <w:r>
+        <w:rPr>
+          <w:b/>
+        </w:rPr>
+        <w:t>Semana 28 (14 de Septiembre del 2026 al 18 de Septiembre del 2026)</w:t>
+      </w:r>
+    </w:p>
+    <w:p>
+      <w:pPr>
+        <w:jc w:val="both"/>
+      </w:pPr>
+      <w:r>
+        <w:t>El 14 de Septiembre terminé con los ajustes preliminares del Game Master; comencé con la redacción del Reporte final de actividades del Servicio Social.</w:t>
       </w:r>
       <w:bookmarkStart w:id="0" w:name="_GoBack"/>
       <w:bookmarkEnd w:id="0"/>
@@ -1714,7 +1748,7 @@
 </file>
 
 <file path=customXml/itemProps1.xml><?xml version="1.0" encoding="utf-8"?>
-<ds:datastoreItem xmlns:ds="http://schemas.openxmlformats.org/officeDocument/2006/customXml" ds:itemID="{950FE48F-33DC-47B2-B6C9-FFE432E1D4D5}">
+<ds:datastoreItem xmlns:ds="http://schemas.openxmlformats.org/officeDocument/2006/customXml" ds:itemID="{F6BF5B8E-44A2-4C41-86C4-E97B24C7CE2A}">
   <ds:schemaRefs>
     <ds:schemaRef ds:uri="http://schemas.openxmlformats.org/officeDocument/2006/bibliography"/>
   </ds:schemaRefs>

</xml_diff>

<commit_message>
Se agregan parametros para mejorar la calibracion de los brazos en el minijuego 1
</commit_message>
<xml_diff>
--- a/ReporteActividades.docx
+++ b/ReporteActividades.docx
@@ -1044,6 +1044,9 @@
       </w:pPr>
       <w:r>
         <w:t>El 14 de Septiembre terminé con los ajustes preliminares del Game Master; comencé con la redacción del Reporte final de actividades del Servicio Social.</w:t>
+      </w:r>
+      <w:r>
+        <w:t xml:space="preserve"> El 17 de Septiembre comencé con la implementación de unos parámetros para las medidas del antebrazo y el brazo superior, esto esperando a que la calibración del brazo pueda mejorar en base a los diferentes tamaños que llegue a tener el paciente.</w:t>
       </w:r>
       <w:bookmarkStart w:id="0" w:name="_GoBack"/>
       <w:bookmarkEnd w:id="0"/>
@@ -1748,7 +1751,7 @@
 </file>
 
 <file path=customXml/itemProps1.xml><?xml version="1.0" encoding="utf-8"?>
-<ds:datastoreItem xmlns:ds="http://schemas.openxmlformats.org/officeDocument/2006/customXml" ds:itemID="{F6BF5B8E-44A2-4C41-86C4-E97B24C7CE2A}">
+<ds:datastoreItem xmlns:ds="http://schemas.openxmlformats.org/officeDocument/2006/customXml" ds:itemID="{F7B0907E-1299-4DDF-B393-786BD3DEF35E}">
   <ds:schemaRefs>
     <ds:schemaRef ds:uri="http://schemas.openxmlformats.org/officeDocument/2006/bibliography"/>
   </ds:schemaRefs>

</xml_diff>

<commit_message>
Se inicia la implementacion de una aplicacion espejo, es decir, solo se usara una mano pero la otra mano imitara sus movimientos a manera de espejo o reflejo
</commit_message>
<xml_diff>
--- a/ReporteActividades.docx
+++ b/ReporteActividades.docx
@@ -1047,6 +1047,34 @@
       </w:r>
       <w:r>
         <w:t xml:space="preserve"> El 17 de Septiembre comencé con la implementación de unos parámetros para las medidas del antebrazo y el brazo superior, esto esperando a que la calibración del brazo pueda mejorar en base a los diferentes tamaños que llegue a tener el paciente.</w:t>
+      </w:r>
+      <w:r>
+        <w:t xml:space="preserve"> El 18 de Septiembre no pude asistir debido a que se me realizó una endoscopía.</w:t>
+      </w:r>
+    </w:p>
+    <w:p>
+      <w:pPr>
+        <w:jc w:val="both"/>
+        <w:rPr>
+          <w:b/>
+        </w:rPr>
+      </w:pPr>
+      <w:r>
+        <w:rPr>
+          <w:b/>
+        </w:rPr>
+        <w:t>Semana 29 (21 de Septiembre del 2026 al 25 de Septiembre del 2026)</w:t>
+      </w:r>
+    </w:p>
+    <w:p>
+      <w:pPr>
+        <w:jc w:val="both"/>
+      </w:pPr>
+      <w:r>
+        <w:t>El 21 de Septiembre continué con la redacción del informe final, reanudé el modelado de los personajes del tercer minijuego y recibí una nueva tarea de implementación de parte de Yoás, una aplicación donde una sola mano controle 2 manos, “mirroring”.</w:t>
+      </w:r>
+      <w:r>
+        <w:t xml:space="preserve"> El 22 de Septiembre estuve implementado le nueva aplicación.</w:t>
       </w:r>
       <w:bookmarkStart w:id="0" w:name="_GoBack"/>
       <w:bookmarkEnd w:id="0"/>
@@ -1751,7 +1779,7 @@
 </file>
 
 <file path=customXml/itemProps1.xml><?xml version="1.0" encoding="utf-8"?>
-<ds:datastoreItem xmlns:ds="http://schemas.openxmlformats.org/officeDocument/2006/customXml" ds:itemID="{F7B0907E-1299-4DDF-B393-786BD3DEF35E}">
+<ds:datastoreItem xmlns:ds="http://schemas.openxmlformats.org/officeDocument/2006/customXml" ds:itemID="{318CE6FA-419A-4EE3-B8B7-A8F78FCC59CF}">
   <ds:schemaRefs>
     <ds:schemaRef ds:uri="http://schemas.openxmlformats.org/officeDocument/2006/bibliography"/>
   </ds:schemaRefs>

</xml_diff>

<commit_message>
Se soluciona el problema del posicionamiento de la mano reflejada
</commit_message>
<xml_diff>
--- a/ReporteActividades.docx
+++ b/ReporteActividades.docx
@@ -1074,7 +1074,19 @@
         <w:t>El 21 de Septiembre continué con la redacción del informe final, reanudé el modelado de los personajes del tercer minijuego y recibí una nueva tarea de implementación de parte de Yoás, una aplicación donde una sola mano controle 2 manos, “mirroring”.</w:t>
       </w:r>
       <w:r>
-        <w:t xml:space="preserve"> El 22 de Septiembre estuve implementado le nueva aplicación.</w:t>
+        <w:t xml:space="preserve"> Del</w:t>
+      </w:r>
+      <w:r>
+        <w:t xml:space="preserve"> 22</w:t>
+      </w:r>
+      <w:r>
+        <w:t xml:space="preserve"> al 24</w:t>
+      </w:r>
+      <w:r>
+        <w:t xml:space="preserve"> de Septiembre estuve i</w:t>
+      </w:r>
+      <w:r>
+        <w:t>mplementado le nueva aplicación; tomó más tiempo del esperado ya que tuve problemas con la posición de la mano.</w:t>
       </w:r>
       <w:bookmarkStart w:id="0" w:name="_GoBack"/>
       <w:bookmarkEnd w:id="0"/>
@@ -1779,7 +1791,7 @@
 </file>
 
 <file path=customXml/itemProps1.xml><?xml version="1.0" encoding="utf-8"?>
-<ds:datastoreItem xmlns:ds="http://schemas.openxmlformats.org/officeDocument/2006/customXml" ds:itemID="{318CE6FA-419A-4EE3-B8B7-A8F78FCC59CF}">
+<ds:datastoreItem xmlns:ds="http://schemas.openxmlformats.org/officeDocument/2006/customXml" ds:itemID="{46465814-0C11-4256-8916-4A1131B89A51}">
   <ds:schemaRefs>
     <ds:schemaRef ds:uri="http://schemas.openxmlformats.org/officeDocument/2006/bibliography"/>
   </ds:schemaRefs>

</xml_diff>

<commit_message>
Se ajusta la deteccion de la mano derecha para conseguir su reflejo
</commit_message>
<xml_diff>
--- a/ReporteActividades.docx
+++ b/ReporteActividades.docx
@@ -1087,6 +1087,9 @@
       </w:r>
       <w:r>
         <w:t>mplementado le nueva aplicación; tomó más tiempo del esperado ya que tuve problemas con la posición de la mano.</w:t>
+      </w:r>
+      <w:r>
+        <w:t xml:space="preserve"> El 25 de Septiembre se hicieron unos ajustes debido a que el reflejo no aparecía al seleccionar la mano derecha.</w:t>
       </w:r>
       <w:bookmarkStart w:id="0" w:name="_GoBack"/>
       <w:bookmarkEnd w:id="0"/>
@@ -1791,7 +1794,7 @@
 </file>
 
 <file path=customXml/itemProps1.xml><?xml version="1.0" encoding="utf-8"?>
-<ds:datastoreItem xmlns:ds="http://schemas.openxmlformats.org/officeDocument/2006/customXml" ds:itemID="{46465814-0C11-4256-8916-4A1131B89A51}">
+<ds:datastoreItem xmlns:ds="http://schemas.openxmlformats.org/officeDocument/2006/customXml" ds:itemID="{28CCF427-5636-4D2A-9AC4-B6C91CBA7E34}">
   <ds:schemaRefs>
     <ds:schemaRef ds:uri="http://schemas.openxmlformats.org/officeDocument/2006/bibliography"/>
   </ds:schemaRefs>

</xml_diff>

<commit_message>
Se agregan avances de los modelos, la aplicacion de una sola mano continua con detalles
</commit_message>
<xml_diff>
--- a/ReporteActividades.docx
+++ b/ReporteActividades.docx
@@ -1089,7 +1089,35 @@
         <w:t>mplementado le nueva aplicación; tomó más tiempo del esperado ya que tuve problemas con la posición de la mano.</w:t>
       </w:r>
       <w:r>
-        <w:t xml:space="preserve"> El 25 de Septiembre se hicieron unos ajustes debido a que el reflejo no aparecía al seleccionar la mano derecha.</w:t>
+        <w:t xml:space="preserve"> El 25 de Septiembre se hicieron unos ajustes debido a que el reflejo no aparecía al seleccionar la mano </w:t>
+      </w:r>
+      <w:r>
+        <w:t>derecha y continué con los modelos del minijuego 3; Yoás le dio el visto bueno a la aplicación, aunque hay que arreglar los dedos amontonados y que haya un cambio en tiempo real de las manos, ya que estas dejan de estar calibradas al cambio de mano.</w:t>
+      </w:r>
+    </w:p>
+    <w:p>
+      <w:pPr>
+        <w:jc w:val="both"/>
+        <w:rPr>
+          <w:b/>
+        </w:rPr>
+      </w:pPr>
+      <w:r>
+        <w:rPr>
+          <w:b/>
+        </w:rPr>
+        <w:t>Semana 30 (28 de Septiembre del 2026 al 02 de Octubre del 2026)</w:t>
+      </w:r>
+    </w:p>
+    <w:p>
+      <w:pPr>
+        <w:jc w:val="both"/>
+      </w:pPr>
+      <w:r>
+        <w:t>El 28 de Septiembre se continuó con el modelado de los personajes del minijuego 3; se intentó arreglar los detalles de la aplicación comentadas en Viernes pero no hubo éxito.</w:t>
+      </w:r>
+      <w:r>
+        <w:t xml:space="preserve"> El 29 de Septiembre se continuó con el modelado.</w:t>
       </w:r>
       <w:bookmarkStart w:id="0" w:name="_GoBack"/>
       <w:bookmarkEnd w:id="0"/>
@@ -1794,7 +1822,7 @@
 </file>
 
 <file path=customXml/itemProps1.xml><?xml version="1.0" encoding="utf-8"?>
-<ds:datastoreItem xmlns:ds="http://schemas.openxmlformats.org/officeDocument/2006/customXml" ds:itemID="{28CCF427-5636-4D2A-9AC4-B6C91CBA7E34}">
+<ds:datastoreItem xmlns:ds="http://schemas.openxmlformats.org/officeDocument/2006/customXml" ds:itemID="{C6634DD6-2A68-449F-8C75-D5AD60BD3D49}">
   <ds:schemaRefs>
     <ds:schemaRef ds:uri="http://schemas.openxmlformats.org/officeDocument/2006/bibliography"/>
   </ds:schemaRefs>

</xml_diff>

<commit_message>
Se cotinua con el modelado; hay un detalle en la implementacion de la mano que necesita autorizacion
</commit_message>
<xml_diff>
--- a/ReporteActividades.docx
+++ b/ReporteActividades.docx
@@ -1117,7 +1117,26 @@
         <w:t>El 28 de Septiembre se continuó con el modelado de los personajes del minijuego 3; se intentó arreglar los detalles de la aplicación comentadas en Viernes pero no hubo éxito.</w:t>
       </w:r>
       <w:r>
-        <w:t xml:space="preserve"> El 29 de Septiembre se continuó con el modelado.</w:t>
+        <w:t xml:space="preserve"> El 29</w:t>
+      </w:r>
+      <w:r>
+        <w:t xml:space="preserve"> y 30</w:t>
+      </w:r>
+      <w:r>
+        <w:t xml:space="preserve"> de Septiembre se continuó con el modelado.</w:t>
+      </w:r>
+      <w:r>
+        <w:t xml:space="preserve"> El 01 de Octubre me percaté que el cambio en tiempo real entre los lados de la mano funciona pero se necesita que la mano sana esté enfrente del </w:t>
+      </w:r>
+      <w:r>
+        <w:lastRenderedPageBreak/>
+        <w:t>visor 5 se</w:t>
+      </w:r>
+      <w:r>
+        <w:t>gundos antes de hacer el cambio; puedo agregar una cuenta regresiva pero necesito de la autorización de Yoás.</w:t>
+      </w:r>
+      <w:r>
+        <w:t xml:space="preserve"> Se continuó con el modelado.</w:t>
       </w:r>
       <w:bookmarkStart w:id="0" w:name="_GoBack"/>
       <w:bookmarkEnd w:id="0"/>
@@ -1822,7 +1841,7 @@
 </file>
 
 <file path=customXml/itemProps1.xml><?xml version="1.0" encoding="utf-8"?>
-<ds:datastoreItem xmlns:ds="http://schemas.openxmlformats.org/officeDocument/2006/customXml" ds:itemID="{C6634DD6-2A68-449F-8C75-D5AD60BD3D49}">
+<ds:datastoreItem xmlns:ds="http://schemas.openxmlformats.org/officeDocument/2006/customXml" ds:itemID="{BFB382DF-5E6A-4088-83D9-A09C82BC8600}">
   <ds:schemaRefs>
     <ds:schemaRef ds:uri="http://schemas.openxmlformats.org/officeDocument/2006/bibliography"/>
   </ds:schemaRefs>

</xml_diff>

<commit_message>
Se continua con el modelado
</commit_message>
<xml_diff>
--- a/ReporteActividades.docx
+++ b/ReporteActividades.docx
@@ -1126,17 +1126,20 @@
         <w:t xml:space="preserve"> de Septiembre se continuó con el modelado.</w:t>
       </w:r>
       <w:r>
-        <w:t xml:space="preserve"> El 01 de Octubre me percaté que el cambio en tiempo real entre los lados de la mano funciona pero se necesita que la mano sana esté enfrente del </w:t>
+        <w:t xml:space="preserve"> El 01 de Octubre me percaté que el cambio en tiempo real entre los lados de la mano funciona pero se necesita que la mano sana esté enfrente del visor 5 se</w:t>
+      </w:r>
+      <w:r>
+        <w:t xml:space="preserve">gundos antes de hacer el cambio; puedo agregar una cuenta regresiva pero necesito </w:t>
       </w:r>
       <w:r>
         <w:lastRenderedPageBreak/>
-        <w:t>visor 5 se</w:t>
-      </w:r>
-      <w:r>
-        <w:t>gundos antes de hacer el cambio; puedo agregar una cuenta regresiva pero necesito de la autorización de Yoás.</w:t>
+        <w:t>de la autorización de Yoás.</w:t>
       </w:r>
       <w:r>
         <w:t xml:space="preserve"> Se continuó con el modelado.</w:t>
+      </w:r>
+      <w:r>
+        <w:t xml:space="preserve"> El 02 de Octubre Yoás no pudo venir para el Anexo, por lo que continué con el modelado.</w:t>
       </w:r>
       <w:bookmarkStart w:id="0" w:name="_GoBack"/>
       <w:bookmarkEnd w:id="0"/>
@@ -1841,7 +1844,7 @@
 </file>
 
 <file path=customXml/itemProps1.xml><?xml version="1.0" encoding="utf-8"?>
-<ds:datastoreItem xmlns:ds="http://schemas.openxmlformats.org/officeDocument/2006/customXml" ds:itemID="{BFB382DF-5E6A-4088-83D9-A09C82BC8600}">
+<ds:datastoreItem xmlns:ds="http://schemas.openxmlformats.org/officeDocument/2006/customXml" ds:itemID="{37889AA7-0C89-453B-960C-2F7667456034}">
   <ds:schemaRefs>
     <ds:schemaRef ds:uri="http://schemas.openxmlformats.org/officeDocument/2006/bibliography"/>
   </ds:schemaRefs>

</xml_diff>

<commit_message>
Se implementa y configuran los elementos del escenario del minijuego 3, propocionado por Vanessa
</commit_message>
<xml_diff>
--- a/ReporteActividades.docx
+++ b/ReporteActividades.docx
@@ -1163,8 +1163,38 @@
       <w:r>
         <w:t>El 05 de Octubre no pude asistir debido a una urgencia médica. El 06 de Octubre continué modelando. Fui llamado al LANR para probar un juego de un miembro que está trabajando su tesis; Yoás me comentó que ese día no iría al Anexo.</w:t>
       </w:r>
+      <w:r>
+        <w:t xml:space="preserve"> El 07 de Octubre continué modelando, para el final del día Yoás me avisó que el escenario para el minijuego 3 ya estaba listo, pero tuve pro</w:t>
+      </w:r>
+      <w:r>
+        <w:t xml:space="preserve">blemas para importar el archivo de tipo </w:t>
+      </w:r>
+      <w:r>
+        <w:rPr>
+          <w:i/>
+        </w:rPr>
+        <w:t>fbx</w:t>
+      </w:r>
+      <w:r>
+        <w:t xml:space="preserve"> en Unity, por lo que solicité un archivo </w:t>
+      </w:r>
+      <w:r>
+        <w:rPr>
+          <w:i/>
+        </w:rPr>
+        <w:t>unitypackage</w:t>
+      </w:r>
+      <w:r>
+        <w:t>.</w:t>
+      </w:r>
+      <w:r>
+        <w:t xml:space="preserve"> El 08 de Octubre terminé con los modelos de los personajes, siguen sus bastones. El 09 de Octubre estuve configurando los mesh de los objetos de la mazmorra de la bruja, unitypackage que hizo Vanessa.</w:t>
+      </w:r>
       <w:bookmarkStart w:id="0" w:name="_GoBack"/>
       <w:bookmarkEnd w:id="0"/>
+      <w:r>
+        <w:t xml:space="preserve"> </w:t>
+      </w:r>
     </w:p>
     <w:sectPr>
       <w:pgSz w:w="11906" w:h="16838"/>
@@ -1866,7 +1896,7 @@
 </file>
 
 <file path=customXml/itemProps1.xml><?xml version="1.0" encoding="utf-8"?>
-<ds:datastoreItem xmlns:ds="http://schemas.openxmlformats.org/officeDocument/2006/customXml" ds:itemID="{BCA2BBA3-6F62-417E-AE27-0F57B91CF893}">
+<ds:datastoreItem xmlns:ds="http://schemas.openxmlformats.org/officeDocument/2006/customXml" ds:itemID="{E4C6AD79-5F00-4D88-9289-CF0278455BB4}">
   <ds:schemaRefs>
     <ds:schemaRef ds:uri="http://schemas.openxmlformats.org/officeDocument/2006/bibliography"/>
   </ds:schemaRefs>

</xml_diff>

<commit_message>
Se inician las texturas de rostro de los modelos del minijuego 3
</commit_message>
<xml_diff>
--- a/ReporteActividades.docx
+++ b/ReporteActividades.docx
@@ -1217,6 +1217,9 @@
       </w:r>
       <w:r>
         <w:t xml:space="preserve"> El 13 de Octubre se empezaron a hacer las texturas de los modelos.</w:t>
+      </w:r>
+      <w:r>
+        <w:t xml:space="preserve"> El 16 de Octubre se trató de mejorar la Mano Espejo pero no hubo éxito, continuo con las texturas de los rostros de los modelos.</w:t>
       </w:r>
       <w:bookmarkStart w:id="0" w:name="_GoBack"/>
       <w:bookmarkEnd w:id="0"/>
@@ -1921,7 +1924,7 @@
 </file>
 
 <file path=customXml/itemProps1.xml><?xml version="1.0" encoding="utf-8"?>
-<ds:datastoreItem xmlns:ds="http://schemas.openxmlformats.org/officeDocument/2006/customXml" ds:itemID="{46CA49D9-19F4-4FEF-8D8A-20219E357939}">
+<ds:datastoreItem xmlns:ds="http://schemas.openxmlformats.org/officeDocument/2006/customXml" ds:itemID="{544AA83C-0F3C-4BE9-9D8A-53B76F5BB6BA}">
   <ds:schemaRefs>
     <ds:schemaRef ds:uri="http://schemas.openxmlformats.org/officeDocument/2006/bibliography"/>
   </ds:schemaRefs>

</xml_diff>

<commit_message>
Se completa las texturas y materiales de los modelos, se inicia con los rigs; la aplicacion Mirror ahora primero tiene que configurar cada lado individualmete ayudandose de los botones para despues poder alternar de mano en tiempo real
</commit_message>
<xml_diff>
--- a/ReporteActividades.docx
+++ b/ReporteActividades.docx
@@ -1220,6 +1220,31 @@
       </w:r>
       <w:r>
         <w:t xml:space="preserve"> El 16 de Octubre se trató de mejorar la Mano Espejo pero no hubo éxito, continuo con las texturas de los rostros de los modelos.</w:t>
+      </w:r>
+    </w:p>
+    <w:p>
+      <w:pPr>
+        <w:jc w:val="both"/>
+        <w:rPr>
+          <w:b/>
+        </w:rPr>
+      </w:pPr>
+      <w:r>
+        <w:rPr>
+          <w:b/>
+        </w:rPr>
+        <w:t>Semana 33 (19 de Octubre del 2026 al 23 de Octubre del 2026)</w:t>
+      </w:r>
+    </w:p>
+    <w:p>
+      <w:pPr>
+        <w:jc w:val="both"/>
+      </w:pPr>
+      <w:r>
+        <w:t>El 19 de Octubre tuve una cita en el H. G. Z. 47, por lo que no pude asistir. El 20 de Octubre volví a intentar modificar la aplicación del espejo pero no hubo suerte, terminé con las texturas de rostro de los modelos del minijuego 3.</w:t>
+      </w:r>
+      <w:r>
+        <w:t xml:space="preserve"> El 21 de Octubre terminé con los materiales y texturas de los modelos, inicié con sus rigs; por el lado de la aplicación, se logró una forma donde el sistema debe configurar cada lado individualmente para después ya poder alternar de manos en cualquier momento que el usuario lo escoja.</w:t>
       </w:r>
       <w:bookmarkStart w:id="0" w:name="_GoBack"/>
       <w:bookmarkEnd w:id="0"/>
@@ -1924,7 +1949,7 @@
 </file>
 
 <file path=customXml/itemProps1.xml><?xml version="1.0" encoding="utf-8"?>
-<ds:datastoreItem xmlns:ds="http://schemas.openxmlformats.org/officeDocument/2006/customXml" ds:itemID="{544AA83C-0F3C-4BE9-9D8A-53B76F5BB6BA}">
+<ds:datastoreItem xmlns:ds="http://schemas.openxmlformats.org/officeDocument/2006/customXml" ds:itemID="{6AECE093-65D3-4C64-856A-7A980A619A96}">
   <ds:schemaRefs>
     <ds:schemaRef ds:uri="http://schemas.openxmlformats.org/officeDocument/2006/bibliography"/>
   </ds:schemaRefs>

</xml_diff>

<commit_message>
Se cambia el sistema de interaccion con el usuario, el terapeuta ya no puede seleccinar la mano, solo el usuario
</commit_message>
<xml_diff>
--- a/ReporteActividades.docx
+++ b/ReporteActividades.docx
@@ -1245,6 +1245,9 @@
       </w:r>
       <w:r>
         <w:t xml:space="preserve"> El 21 de Octubre terminé con los materiales y texturas de los modelos, inicié con sus rigs; por el lado de la aplicación, se logró una forma donde el sistema debe configurar cada lado individualmente para después ya poder alternar de manos en cualquier momento que el usuario lo escoja.</w:t>
+      </w:r>
+      <w:r>
+        <w:t xml:space="preserve"> El 22 de Octubre se cambió el sistema de interacción del espejo para que el paciente sea el único que toque los botones de las manos; se encontró una aplicación para poder pasar las aplicaciones al visor sin necesidad de cables, pero necesito acceder a la cuenta Meta del LANR.</w:t>
       </w:r>
       <w:bookmarkStart w:id="0" w:name="_GoBack"/>
       <w:bookmarkEnd w:id="0"/>
@@ -1949,7 +1952,7 @@
 </file>
 
 <file path=customXml/itemProps1.xml><?xml version="1.0" encoding="utf-8"?>
-<ds:datastoreItem xmlns:ds="http://schemas.openxmlformats.org/officeDocument/2006/customXml" ds:itemID="{6AECE093-65D3-4C64-856A-7A980A619A96}">
+<ds:datastoreItem xmlns:ds="http://schemas.openxmlformats.org/officeDocument/2006/customXml" ds:itemID="{BF75A57D-7D5A-482A-8C54-B7EF77DEFCA1}">
   <ds:schemaRefs>
     <ds:schemaRef ds:uri="http://schemas.openxmlformats.org/officeDocument/2006/bibliography"/>
   </ds:schemaRefs>

</xml_diff>

<commit_message>
Se comienza con el modelado de la puerta para el minijuego 2, la aplicacion de Mirror ya funciona bien
</commit_message>
<xml_diff>
--- a/ReporteActividades.docx
+++ b/ReporteActividades.docx
@@ -1248,6 +1248,28 @@
       </w:r>
       <w:r>
         <w:t xml:space="preserve"> El 22 de Octubre se cambió el sistema de interacción del espejo para que el paciente sea el único que toque los botones de las manos; se encontró una aplicación para poder pasar las aplicaciones al visor sin necesidad de cables, pero necesito acceder a la cuenta Meta del LANR.</w:t>
+      </w:r>
+    </w:p>
+    <w:p>
+      <w:pPr>
+        <w:jc w:val="both"/>
+        <w:rPr>
+          <w:b/>
+        </w:rPr>
+      </w:pPr>
+      <w:r>
+        <w:rPr>
+          <w:b/>
+        </w:rPr>
+        <w:t>Semana 34 (26 de Octubre del 2026 al 30 de Octubre del 2026)</w:t>
+      </w:r>
+    </w:p>
+    <w:p>
+      <w:pPr>
+        <w:jc w:val="both"/>
+      </w:pPr>
+      <w:r>
+        <w:t>El 16 de Octubre se logró instalar y acceder al Meta Quest Developer Hub, donde pudimos instalar el APK de la aplicación Mirror para así ya no prescindir de una conexión física a la computadora para probar la Mano Espejo; queda una prueba final por parte de Yoás. El mismo día se comenzó con el modelado de la Puerta del minijuego 2.</w:t>
       </w:r>
       <w:bookmarkStart w:id="0" w:name="_GoBack"/>
       <w:bookmarkEnd w:id="0"/>
@@ -1952,7 +1974,7 @@
 </file>
 
 <file path=customXml/itemProps1.xml><?xml version="1.0" encoding="utf-8"?>
-<ds:datastoreItem xmlns:ds="http://schemas.openxmlformats.org/officeDocument/2006/customXml" ds:itemID="{BF75A57D-7D5A-482A-8C54-B7EF77DEFCA1}">
+<ds:datastoreItem xmlns:ds="http://schemas.openxmlformats.org/officeDocument/2006/customXml" ds:itemID="{801B0FE3-E26C-4A7D-93FD-1F5282A80AA8}">
   <ds:schemaRefs>
     <ds:schemaRef ds:uri="http://schemas.openxmlformats.org/officeDocument/2006/bibliography"/>
   </ds:schemaRefs>

</xml_diff>